<commit_message>
Se actualiza automaticamente otros valores al abrir la pagina
</commit_message>
<xml_diff>
--- a/documentacion/RequerimientoContabilidad_01.docx
+++ b/documentacion/RequerimientoContabilidad_01.docx
@@ -804,10 +804,7 @@
         <w:t>INVERSION</w:t>
       </w:r>
       <w:r>
-        <w:t xml:space="preserve"> </w:t>
-      </w:r>
-      <w:r>
-        <w:t xml:space="preserve"> (</w:t>
+        <w:t xml:space="preserve">  (</w:t>
       </w:r>
       <w:proofErr w:type="spellStart"/>
       <w:proofErr w:type="gramEnd"/>
@@ -822,10 +819,7 @@
         <w:t>18</w:t>
       </w:r>
       <w:r>
-        <w:t>2</w:t>
-      </w:r>
-      <w:r>
-        <w:t>)</w:t>
+        <w:t>2)</w:t>
       </w:r>
     </w:p>
     <w:p>
@@ -968,13 +962,7 @@
       </w:r>
       <w:proofErr w:type="spellEnd"/>
       <w:r>
-        <w:t xml:space="preserve"> = </w:t>
-      </w:r>
-      <w:r>
-        <w:t>2</w:t>
-      </w:r>
-      <w:r>
-        <w:t>)</w:t>
+        <w:t xml:space="preserve"> = 2)</w:t>
       </w:r>
       <w:r>
         <w:br/>
@@ -991,10 +979,7 @@
         <w:t>Isabel</w:t>
       </w:r>
       <w:r>
-        <w:t xml:space="preserve"> </w:t>
-      </w:r>
-      <w:r>
-        <w:t xml:space="preserve"> (</w:t>
+        <w:t xml:space="preserve">  (</w:t>
       </w:r>
       <w:proofErr w:type="spellStart"/>
       <w:proofErr w:type="gramEnd"/>
@@ -1003,13 +988,7 @@
       </w:r>
       <w:proofErr w:type="spellEnd"/>
       <w:r>
-        <w:t xml:space="preserve"> = </w:t>
-      </w:r>
-      <w:r>
-        <w:t>3</w:t>
-      </w:r>
-      <w:r>
-        <w:t>)</w:t>
+        <w:t xml:space="preserve"> = 3)</w:t>
       </w:r>
     </w:p>
     <w:p>
@@ -2930,6 +2909,2349 @@
       <w:pPr>
         <w:spacing w:after="0" w:line="240" w:lineRule="auto"/>
       </w:pPr>
+    </w:p>
+    <w:p>
+      <w:pPr>
+        <w:spacing w:after="0" w:line="240" w:lineRule="auto"/>
+      </w:pPr>
+    </w:p>
+    <w:p>
+      <w:pPr>
+        <w:spacing w:after="0" w:line="240" w:lineRule="auto"/>
+      </w:pPr>
+      <w:r>
+        <w:t>====== =======</w:t>
+      </w:r>
+    </w:p>
+    <w:p>
+      <w:pPr>
+        <w:spacing w:after="0" w:line="240" w:lineRule="auto"/>
+      </w:pPr>
+    </w:p>
+    <w:p>
+      <w:pPr>
+        <w:spacing w:after="0" w:line="240" w:lineRule="auto"/>
+      </w:pPr>
+      <w:r>
+        <w:t xml:space="preserve">La tabla </w:t>
+      </w:r>
+      <w:proofErr w:type="spellStart"/>
+      <w:r>
+        <w:t>movimiento_capital</w:t>
+      </w:r>
+      <w:proofErr w:type="spellEnd"/>
+      <w:r>
+        <w:t xml:space="preserve"> t</w:t>
+      </w:r>
+      <w:r>
+        <w:t>iene la siguiente estructura:</w:t>
+      </w:r>
+    </w:p>
+    <w:p>
+      <w:pPr>
+        <w:spacing w:after="0" w:line="240" w:lineRule="auto"/>
+      </w:pPr>
+    </w:p>
+    <w:p>
+      <w:pPr>
+        <w:spacing w:after="0" w:line="240" w:lineRule="auto"/>
+        <w:rPr>
+          <w:lang w:val="en-US"/>
+        </w:rPr>
+      </w:pPr>
+      <w:r>
+        <w:rPr>
+          <w:lang w:val="en-US"/>
+        </w:rPr>
+        <w:t>CREATE TABLE `</w:t>
+      </w:r>
+      <w:proofErr w:type="spellStart"/>
+      <w:r>
+        <w:rPr>
+          <w:lang w:val="en-US"/>
+        </w:rPr>
+        <w:t>movimiento_capital</w:t>
+      </w:r>
+      <w:proofErr w:type="spellEnd"/>
+      <w:r>
+        <w:rPr>
+          <w:lang w:val="en-US"/>
+        </w:rPr>
+        <w:t>` (</w:t>
+      </w:r>
+    </w:p>
+    <w:p>
+      <w:pPr>
+        <w:spacing w:after="0" w:line="240" w:lineRule="auto"/>
+        <w:rPr>
+          <w:lang w:val="en-US"/>
+        </w:rPr>
+      </w:pPr>
+      <w:r>
+        <w:rPr>
+          <w:lang w:val="en-US"/>
+        </w:rPr>
+        <w:t xml:space="preserve">  `</w:t>
+      </w:r>
+      <w:proofErr w:type="spellStart"/>
+      <w:r>
+        <w:rPr>
+          <w:lang w:val="en-US"/>
+        </w:rPr>
+        <w:t>id_movimiento_capital</w:t>
+      </w:r>
+      <w:proofErr w:type="spellEnd"/>
+      <w:r>
+        <w:rPr>
+          <w:lang w:val="en-US"/>
+        </w:rPr>
+        <w:t xml:space="preserve">` </w:t>
+      </w:r>
+      <w:proofErr w:type="gramStart"/>
+      <w:r>
+        <w:rPr>
+          <w:lang w:val="en-US"/>
+        </w:rPr>
+        <w:t>int(</w:t>
+      </w:r>
+      <w:proofErr w:type="gramEnd"/>
+      <w:r>
+        <w:rPr>
+          <w:lang w:val="en-US"/>
+        </w:rPr>
+        <w:t>11) NOT NULL AUTO_INCREMENT,</w:t>
+      </w:r>
+    </w:p>
+    <w:p>
+      <w:pPr>
+        <w:spacing w:after="0" w:line="240" w:lineRule="auto"/>
+        <w:rPr>
+          <w:lang w:val="en-US"/>
+        </w:rPr>
+      </w:pPr>
+      <w:r>
+        <w:rPr>
+          <w:lang w:val="en-US"/>
+        </w:rPr>
+        <w:t xml:space="preserve">  `</w:t>
+      </w:r>
+      <w:proofErr w:type="spellStart"/>
+      <w:r>
+        <w:rPr>
+          <w:lang w:val="en-US"/>
+        </w:rPr>
+        <w:t>id_tipo_movimiento</w:t>
+      </w:r>
+      <w:proofErr w:type="spellEnd"/>
+      <w:r>
+        <w:rPr>
+          <w:lang w:val="en-US"/>
+        </w:rPr>
+        <w:t xml:space="preserve">` </w:t>
+      </w:r>
+      <w:proofErr w:type="gramStart"/>
+      <w:r>
+        <w:rPr>
+          <w:lang w:val="en-US"/>
+        </w:rPr>
+        <w:t>int(</w:t>
+      </w:r>
+      <w:proofErr w:type="gramEnd"/>
+      <w:r>
+        <w:rPr>
+          <w:lang w:val="en-US"/>
+        </w:rPr>
+        <w:t>11) NOT NULL,</w:t>
+      </w:r>
+    </w:p>
+    <w:p>
+      <w:pPr>
+        <w:spacing w:after="0" w:line="240" w:lineRule="auto"/>
+        <w:rPr>
+          <w:lang w:val="en-US"/>
+        </w:rPr>
+      </w:pPr>
+      <w:r>
+        <w:rPr>
+          <w:lang w:val="en-US"/>
+        </w:rPr>
+        <w:t xml:space="preserve">  `</w:t>
+      </w:r>
+      <w:proofErr w:type="spellStart"/>
+      <w:r>
+        <w:rPr>
+          <w:lang w:val="en-US"/>
+        </w:rPr>
+        <w:t>id_inversion</w:t>
+      </w:r>
+      <w:proofErr w:type="spellEnd"/>
+      <w:r>
+        <w:rPr>
+          <w:lang w:val="en-US"/>
+        </w:rPr>
+        <w:t xml:space="preserve">` </w:t>
+      </w:r>
+      <w:proofErr w:type="gramStart"/>
+      <w:r>
+        <w:rPr>
+          <w:lang w:val="en-US"/>
+        </w:rPr>
+        <w:t>int(</w:t>
+      </w:r>
+      <w:proofErr w:type="gramEnd"/>
+      <w:r>
+        <w:rPr>
+          <w:lang w:val="en-US"/>
+        </w:rPr>
+        <w:t>11) DEFAULT NULL,</w:t>
+      </w:r>
+    </w:p>
+    <w:p>
+      <w:pPr>
+        <w:spacing w:after="0" w:line="240" w:lineRule="auto"/>
+        <w:rPr>
+          <w:lang w:val="en-US"/>
+        </w:rPr>
+      </w:pPr>
+      <w:r>
+        <w:rPr>
+          <w:lang w:val="en-US"/>
+        </w:rPr>
+        <w:t xml:space="preserve">  `</w:t>
+      </w:r>
+      <w:proofErr w:type="spellStart"/>
+      <w:r>
+        <w:rPr>
+          <w:lang w:val="en-US"/>
+        </w:rPr>
+        <w:t>id_venta_inversion</w:t>
+      </w:r>
+      <w:proofErr w:type="spellEnd"/>
+      <w:r>
+        <w:rPr>
+          <w:lang w:val="en-US"/>
+        </w:rPr>
+        <w:t xml:space="preserve">` </w:t>
+      </w:r>
+      <w:proofErr w:type="gramStart"/>
+      <w:r>
+        <w:rPr>
+          <w:lang w:val="en-US"/>
+        </w:rPr>
+        <w:t>int(</w:t>
+      </w:r>
+      <w:proofErr w:type="gramEnd"/>
+      <w:r>
+        <w:rPr>
+          <w:lang w:val="en-US"/>
+        </w:rPr>
+        <w:t>11) DEFAULT NULL,</w:t>
+      </w:r>
+    </w:p>
+    <w:p>
+      <w:pPr>
+        <w:spacing w:after="0" w:line="240" w:lineRule="auto"/>
+        <w:rPr>
+          <w:lang w:val="en-US"/>
+        </w:rPr>
+      </w:pPr>
+      <w:r>
+        <w:rPr>
+          <w:lang w:val="en-US"/>
+        </w:rPr>
+        <w:t xml:space="preserve">  `</w:t>
+      </w:r>
+      <w:proofErr w:type="spellStart"/>
+      <w:r>
+        <w:rPr>
+          <w:lang w:val="en-US"/>
+        </w:rPr>
+        <w:t>id_cuenta_bancaria</w:t>
+      </w:r>
+      <w:proofErr w:type="spellEnd"/>
+      <w:r>
+        <w:rPr>
+          <w:lang w:val="en-US"/>
+        </w:rPr>
+        <w:t xml:space="preserve">` </w:t>
+      </w:r>
+      <w:proofErr w:type="gramStart"/>
+      <w:r>
+        <w:rPr>
+          <w:lang w:val="en-US"/>
+        </w:rPr>
+        <w:t>int(</w:t>
+      </w:r>
+      <w:proofErr w:type="gramEnd"/>
+      <w:r>
+        <w:rPr>
+          <w:lang w:val="en-US"/>
+        </w:rPr>
+        <w:t>11) DEFAULT NULL,</w:t>
+      </w:r>
+    </w:p>
+    <w:p>
+      <w:pPr>
+        <w:spacing w:after="0" w:line="240" w:lineRule="auto"/>
+        <w:rPr>
+          <w:lang w:val="en-US"/>
+        </w:rPr>
+      </w:pPr>
+      <w:r>
+        <w:rPr>
+          <w:lang w:val="en-US"/>
+        </w:rPr>
+        <w:t xml:space="preserve">  `</w:t>
+      </w:r>
+      <w:proofErr w:type="spellStart"/>
+      <w:r>
+        <w:rPr>
+          <w:lang w:val="en-US"/>
+        </w:rPr>
+        <w:t>id_signo</w:t>
+      </w:r>
+      <w:proofErr w:type="spellEnd"/>
+      <w:r>
+        <w:rPr>
+          <w:lang w:val="en-US"/>
+        </w:rPr>
+        <w:t xml:space="preserve">` </w:t>
+      </w:r>
+      <w:proofErr w:type="gramStart"/>
+      <w:r>
+        <w:rPr>
+          <w:lang w:val="en-US"/>
+        </w:rPr>
+        <w:t>int(</w:t>
+      </w:r>
+      <w:proofErr w:type="gramEnd"/>
+      <w:r>
+        <w:rPr>
+          <w:lang w:val="en-US"/>
+        </w:rPr>
+        <w:t>11) DEFAULT NULL,</w:t>
+      </w:r>
+    </w:p>
+    <w:p>
+      <w:pPr>
+        <w:spacing w:after="0" w:line="240" w:lineRule="auto"/>
+        <w:rPr>
+          <w:lang w:val="en-US"/>
+        </w:rPr>
+      </w:pPr>
+      <w:r>
+        <w:rPr>
+          <w:lang w:val="en-US"/>
+        </w:rPr>
+        <w:t xml:space="preserve">  `</w:t>
+      </w:r>
+      <w:proofErr w:type="spellStart"/>
+      <w:r>
+        <w:rPr>
+          <w:lang w:val="en-US"/>
+        </w:rPr>
+        <w:t>monto</w:t>
+      </w:r>
+      <w:proofErr w:type="spellEnd"/>
+      <w:r>
+        <w:rPr>
+          <w:lang w:val="en-US"/>
+        </w:rPr>
+        <w:t xml:space="preserve">` </w:t>
+      </w:r>
+      <w:proofErr w:type="gramStart"/>
+      <w:r>
+        <w:rPr>
+          <w:lang w:val="en-US"/>
+        </w:rPr>
+        <w:t>decimal(</w:t>
+      </w:r>
+      <w:proofErr w:type="gramEnd"/>
+      <w:r>
+        <w:rPr>
+          <w:lang w:val="en-US"/>
+        </w:rPr>
+        <w:t>18,2) DEFAULT NULL,</w:t>
+      </w:r>
+    </w:p>
+    <w:p>
+      <w:pPr>
+        <w:spacing w:after="0" w:line="240" w:lineRule="auto"/>
+      </w:pPr>
+      <w:r>
+        <w:rPr>
+          <w:lang w:val="en-US"/>
+        </w:rPr>
+        <w:t xml:space="preserve">  </w:t>
+      </w:r>
+      <w:r>
+        <w:t>`</w:t>
+      </w:r>
+      <w:proofErr w:type="spellStart"/>
+      <w:r>
+        <w:t>fecha_movimiento</w:t>
+      </w:r>
+      <w:proofErr w:type="spellEnd"/>
+      <w:r>
+        <w:t>` date NOT NULL,</w:t>
+      </w:r>
+    </w:p>
+    <w:p>
+      <w:pPr>
+        <w:spacing w:after="0" w:line="240" w:lineRule="auto"/>
+      </w:pPr>
+      <w:r>
+        <w:t xml:space="preserve">  `</w:t>
+      </w:r>
+      <w:proofErr w:type="spellStart"/>
+      <w:r>
+        <w:t>descripcion</w:t>
+      </w:r>
+      <w:proofErr w:type="spellEnd"/>
+      <w:r>
+        <w:t xml:space="preserve">` </w:t>
+      </w:r>
+      <w:proofErr w:type="spellStart"/>
+      <w:proofErr w:type="gramStart"/>
+      <w:r>
+        <w:t>varchar</w:t>
+      </w:r>
+      <w:proofErr w:type="spellEnd"/>
+      <w:r>
+        <w:t>(</w:t>
+      </w:r>
+      <w:proofErr w:type="gramEnd"/>
+      <w:r>
+        <w:t>255) DEFAULT NULL,</w:t>
+      </w:r>
+    </w:p>
+    <w:p>
+      <w:pPr>
+        <w:spacing w:after="0" w:line="240" w:lineRule="auto"/>
+      </w:pPr>
+      <w:r>
+        <w:t xml:space="preserve">  `conciliado` </w:t>
+      </w:r>
+      <w:proofErr w:type="spellStart"/>
+      <w:proofErr w:type="gramStart"/>
+      <w:r>
+        <w:t>tinyint</w:t>
+      </w:r>
+      <w:proofErr w:type="spellEnd"/>
+      <w:r>
+        <w:t>(</w:t>
+      </w:r>
+      <w:proofErr w:type="gramEnd"/>
+      <w:r>
+        <w:t>4) DEFAULT 0,</w:t>
+      </w:r>
+    </w:p>
+    <w:p>
+      <w:pPr>
+        <w:spacing w:after="0" w:line="240" w:lineRule="auto"/>
+      </w:pPr>
+      <w:r>
+        <w:t xml:space="preserve">  `</w:t>
+      </w:r>
+      <w:proofErr w:type="spellStart"/>
+      <w:r>
+        <w:t>fecha_conciliacion</w:t>
+      </w:r>
+      <w:proofErr w:type="spellEnd"/>
+      <w:r>
+        <w:t>` date DEFAULT NULL,</w:t>
+      </w:r>
+    </w:p>
+    <w:p>
+      <w:pPr>
+        <w:spacing w:after="0" w:line="240" w:lineRule="auto"/>
+        <w:rPr>
+          <w:lang w:val="en-US"/>
+        </w:rPr>
+      </w:pPr>
+      <w:r>
+        <w:t xml:space="preserve">  </w:t>
+      </w:r>
+      <w:r>
+        <w:rPr>
+          <w:lang w:val="en-US"/>
+        </w:rPr>
+        <w:t>`</w:t>
+      </w:r>
+      <w:proofErr w:type="spellStart"/>
+      <w:r>
+        <w:rPr>
+          <w:lang w:val="en-US"/>
+        </w:rPr>
+        <w:t>activo</w:t>
+      </w:r>
+      <w:proofErr w:type="spellEnd"/>
+      <w:r>
+        <w:rPr>
+          <w:lang w:val="en-US"/>
+        </w:rPr>
+        <w:t xml:space="preserve">` </w:t>
+      </w:r>
+      <w:proofErr w:type="spellStart"/>
+      <w:proofErr w:type="gramStart"/>
+      <w:r>
+        <w:rPr>
+          <w:lang w:val="en-US"/>
+        </w:rPr>
+        <w:t>tinyint</w:t>
+      </w:r>
+      <w:proofErr w:type="spellEnd"/>
+      <w:r>
+        <w:rPr>
+          <w:lang w:val="en-US"/>
+        </w:rPr>
+        <w:t>(</w:t>
+      </w:r>
+      <w:proofErr w:type="gramEnd"/>
+      <w:r>
+        <w:rPr>
+          <w:lang w:val="en-US"/>
+        </w:rPr>
+        <w:t>4) DEFAULT 1,</w:t>
+      </w:r>
+    </w:p>
+    <w:p>
+      <w:pPr>
+        <w:spacing w:after="0" w:line="240" w:lineRule="auto"/>
+        <w:rPr>
+          <w:lang w:val="en-US"/>
+        </w:rPr>
+      </w:pPr>
+      <w:r>
+        <w:rPr>
+          <w:lang w:val="en-US"/>
+        </w:rPr>
+        <w:t xml:space="preserve">  `</w:t>
+      </w:r>
+      <w:proofErr w:type="spellStart"/>
+      <w:r>
+        <w:rPr>
+          <w:lang w:val="en-US"/>
+        </w:rPr>
+        <w:t>eliminado</w:t>
+      </w:r>
+      <w:proofErr w:type="spellEnd"/>
+      <w:r>
+        <w:rPr>
+          <w:lang w:val="en-US"/>
+        </w:rPr>
+        <w:t xml:space="preserve">` </w:t>
+      </w:r>
+      <w:proofErr w:type="spellStart"/>
+      <w:proofErr w:type="gramStart"/>
+      <w:r>
+        <w:rPr>
+          <w:lang w:val="en-US"/>
+        </w:rPr>
+        <w:t>tinyint</w:t>
+      </w:r>
+      <w:proofErr w:type="spellEnd"/>
+      <w:r>
+        <w:rPr>
+          <w:lang w:val="en-US"/>
+        </w:rPr>
+        <w:t>(</w:t>
+      </w:r>
+      <w:proofErr w:type="gramEnd"/>
+      <w:r>
+        <w:rPr>
+          <w:lang w:val="en-US"/>
+        </w:rPr>
+        <w:t>4) DEFAULT 0,</w:t>
+      </w:r>
+    </w:p>
+    <w:p>
+      <w:pPr>
+        <w:spacing w:after="0" w:line="240" w:lineRule="auto"/>
+        <w:rPr>
+          <w:lang w:val="en-US"/>
+        </w:rPr>
+      </w:pPr>
+      <w:r>
+        <w:rPr>
+          <w:lang w:val="en-US"/>
+        </w:rPr>
+        <w:t xml:space="preserve">  `</w:t>
+      </w:r>
+      <w:proofErr w:type="spellStart"/>
+      <w:r>
+        <w:rPr>
+          <w:lang w:val="en-US"/>
+        </w:rPr>
+        <w:t>fecha_creacion</w:t>
+      </w:r>
+      <w:proofErr w:type="spellEnd"/>
+      <w:r>
+        <w:rPr>
+          <w:lang w:val="en-US"/>
+        </w:rPr>
+        <w:t xml:space="preserve">` datetime NOT NULL DEFAULT </w:t>
+      </w:r>
+      <w:proofErr w:type="spellStart"/>
+      <w:r>
+        <w:rPr>
+          <w:lang w:val="en-US"/>
+        </w:rPr>
+        <w:t>current_</w:t>
+      </w:r>
+      <w:proofErr w:type="gramStart"/>
+      <w:r>
+        <w:rPr>
+          <w:lang w:val="en-US"/>
+        </w:rPr>
+        <w:t>timestamp</w:t>
+      </w:r>
+      <w:proofErr w:type="spellEnd"/>
+      <w:r>
+        <w:rPr>
+          <w:lang w:val="en-US"/>
+        </w:rPr>
+        <w:t>(</w:t>
+      </w:r>
+      <w:proofErr w:type="gramEnd"/>
+      <w:r>
+        <w:rPr>
+          <w:lang w:val="en-US"/>
+        </w:rPr>
+        <w:t>),</w:t>
+      </w:r>
+    </w:p>
+    <w:p>
+      <w:pPr>
+        <w:spacing w:after="0" w:line="240" w:lineRule="auto"/>
+        <w:rPr>
+          <w:lang w:val="en-US"/>
+        </w:rPr>
+      </w:pPr>
+      <w:r>
+        <w:rPr>
+          <w:lang w:val="en-US"/>
+        </w:rPr>
+        <w:t xml:space="preserve">  `</w:t>
+      </w:r>
+      <w:proofErr w:type="spellStart"/>
+      <w:r>
+        <w:rPr>
+          <w:lang w:val="en-US"/>
+        </w:rPr>
+        <w:t>fecha_actualizacion</w:t>
+      </w:r>
+      <w:proofErr w:type="spellEnd"/>
+      <w:r>
+        <w:rPr>
+          <w:lang w:val="en-US"/>
+        </w:rPr>
+        <w:t xml:space="preserve">` datetime NOT NULL DEFAULT </w:t>
+      </w:r>
+      <w:proofErr w:type="spellStart"/>
+      <w:r>
+        <w:rPr>
+          <w:lang w:val="en-US"/>
+        </w:rPr>
+        <w:t>current_</w:t>
+      </w:r>
+      <w:proofErr w:type="gramStart"/>
+      <w:r>
+        <w:rPr>
+          <w:lang w:val="en-US"/>
+        </w:rPr>
+        <w:t>timestamp</w:t>
+      </w:r>
+      <w:proofErr w:type="spellEnd"/>
+      <w:r>
+        <w:rPr>
+          <w:lang w:val="en-US"/>
+        </w:rPr>
+        <w:t>(</w:t>
+      </w:r>
+      <w:proofErr w:type="gramEnd"/>
+      <w:r>
+        <w:rPr>
+          <w:lang w:val="en-US"/>
+        </w:rPr>
+        <w:t xml:space="preserve">) ON UPDATE </w:t>
+      </w:r>
+      <w:proofErr w:type="spellStart"/>
+      <w:r>
+        <w:rPr>
+          <w:lang w:val="en-US"/>
+        </w:rPr>
+        <w:t>current_timestamp</w:t>
+      </w:r>
+      <w:proofErr w:type="spellEnd"/>
+      <w:r>
+        <w:rPr>
+          <w:lang w:val="en-US"/>
+        </w:rPr>
+        <w:t>(),</w:t>
+      </w:r>
+    </w:p>
+    <w:p>
+      <w:pPr>
+        <w:spacing w:after="0" w:line="240" w:lineRule="auto"/>
+      </w:pPr>
+      <w:r>
+        <w:rPr>
+          <w:lang w:val="en-US"/>
+        </w:rPr>
+        <w:t xml:space="preserve">  </w:t>
+      </w:r>
+      <w:r>
+        <w:t>PRIMARY KEY (`</w:t>
+      </w:r>
+      <w:proofErr w:type="spellStart"/>
+      <w:r>
+        <w:t>id_movimiento_capital</w:t>
+      </w:r>
+      <w:proofErr w:type="spellEnd"/>
+      <w:r>
+        <w:t>`),</w:t>
+      </w:r>
+    </w:p>
+    <w:p>
+      <w:pPr>
+        <w:spacing w:after="0" w:line="240" w:lineRule="auto"/>
+      </w:pPr>
+      <w:r>
+        <w:t xml:space="preserve">  KEY `</w:t>
+      </w:r>
+      <w:proofErr w:type="spellStart"/>
+      <w:r>
+        <w:t>fk_movimiento_inversion</w:t>
+      </w:r>
+      <w:proofErr w:type="spellEnd"/>
+      <w:r>
+        <w:t>` (`</w:t>
+      </w:r>
+      <w:proofErr w:type="spellStart"/>
+      <w:r>
+        <w:t>id_inversion</w:t>
+      </w:r>
+      <w:proofErr w:type="spellEnd"/>
+      <w:r>
+        <w:t>`),</w:t>
+      </w:r>
+    </w:p>
+    <w:p>
+      <w:pPr>
+        <w:spacing w:after="0" w:line="240" w:lineRule="auto"/>
+      </w:pPr>
+      <w:r>
+        <w:t xml:space="preserve">  KEY `</w:t>
+      </w:r>
+      <w:proofErr w:type="spellStart"/>
+      <w:r>
+        <w:t>fk_movimiento_venta</w:t>
+      </w:r>
+      <w:proofErr w:type="spellEnd"/>
+      <w:r>
+        <w:t>` (`</w:t>
+      </w:r>
+      <w:proofErr w:type="spellStart"/>
+      <w:r>
+        <w:t>id_venta_inversion</w:t>
+      </w:r>
+      <w:proofErr w:type="spellEnd"/>
+      <w:r>
+        <w:t>`),</w:t>
+      </w:r>
+    </w:p>
+    <w:p>
+      <w:pPr>
+        <w:spacing w:after="0" w:line="240" w:lineRule="auto"/>
+      </w:pPr>
+      <w:r>
+        <w:t xml:space="preserve">  KEY `</w:t>
+      </w:r>
+      <w:proofErr w:type="spellStart"/>
+      <w:r>
+        <w:t>fk_movimiento_cuenta</w:t>
+      </w:r>
+      <w:proofErr w:type="spellEnd"/>
+      <w:r>
+        <w:t>` (`</w:t>
+      </w:r>
+      <w:proofErr w:type="spellStart"/>
+      <w:r>
+        <w:t>id_cuenta_bancaria</w:t>
+      </w:r>
+      <w:proofErr w:type="spellEnd"/>
+      <w:r>
+        <w:t>`),</w:t>
+      </w:r>
+    </w:p>
+    <w:p>
+      <w:pPr>
+        <w:spacing w:after="0" w:line="240" w:lineRule="auto"/>
+      </w:pPr>
+      <w:r>
+        <w:t xml:space="preserve">  KEY `</w:t>
+      </w:r>
+      <w:proofErr w:type="spellStart"/>
+      <w:r>
+        <w:t>fk_movimiento_tipo</w:t>
+      </w:r>
+      <w:proofErr w:type="spellEnd"/>
+      <w:r>
+        <w:t>` (`</w:t>
+      </w:r>
+      <w:proofErr w:type="spellStart"/>
+      <w:r>
+        <w:t>id_tipo_movimiento</w:t>
+      </w:r>
+      <w:proofErr w:type="spellEnd"/>
+      <w:r>
+        <w:t>`),</w:t>
+      </w:r>
+    </w:p>
+    <w:p>
+      <w:pPr>
+        <w:spacing w:after="0" w:line="240" w:lineRule="auto"/>
+      </w:pPr>
+      <w:r>
+        <w:t xml:space="preserve">  CONSTRAINT `</w:t>
+      </w:r>
+      <w:proofErr w:type="spellStart"/>
+      <w:r>
+        <w:t>fk_movimiento_cuenta</w:t>
+      </w:r>
+      <w:proofErr w:type="spellEnd"/>
+      <w:r>
+        <w:t>` FOREIGN KEY (`</w:t>
+      </w:r>
+      <w:proofErr w:type="spellStart"/>
+      <w:r>
+        <w:t>id_cuenta_bancaria</w:t>
+      </w:r>
+      <w:proofErr w:type="spellEnd"/>
+      <w:r>
+        <w:t>`) REFERENCES `</w:t>
+      </w:r>
+      <w:proofErr w:type="spellStart"/>
+      <w:r>
+        <w:t>cuenta_bancaria</w:t>
+      </w:r>
+      <w:proofErr w:type="spellEnd"/>
+      <w:r>
+        <w:t>` (`</w:t>
+      </w:r>
+      <w:proofErr w:type="spellStart"/>
+      <w:r>
+        <w:t>id_cuenta_bancaria</w:t>
+      </w:r>
+      <w:proofErr w:type="spellEnd"/>
+      <w:r>
+        <w:t>`),</w:t>
+      </w:r>
+    </w:p>
+    <w:p>
+      <w:pPr>
+        <w:spacing w:after="0" w:line="240" w:lineRule="auto"/>
+        <w:rPr>
+          <w:lang w:val="en-US"/>
+        </w:rPr>
+      </w:pPr>
+      <w:r>
+        <w:t xml:space="preserve">  </w:t>
+      </w:r>
+      <w:r>
+        <w:rPr>
+          <w:lang w:val="en-US"/>
+        </w:rPr>
+        <w:t>CONSTRAINT `</w:t>
+      </w:r>
+      <w:proofErr w:type="spellStart"/>
+      <w:r>
+        <w:rPr>
+          <w:lang w:val="en-US"/>
+        </w:rPr>
+        <w:t>fk_movimiento_inversion</w:t>
+      </w:r>
+      <w:proofErr w:type="spellEnd"/>
+      <w:r>
+        <w:rPr>
+          <w:lang w:val="en-US"/>
+        </w:rPr>
+        <w:t>` FOREIGN KEY (`</w:t>
+      </w:r>
+      <w:proofErr w:type="spellStart"/>
+      <w:r>
+        <w:rPr>
+          <w:lang w:val="en-US"/>
+        </w:rPr>
+        <w:t>id_inversion</w:t>
+      </w:r>
+      <w:proofErr w:type="spellEnd"/>
+      <w:r>
+        <w:rPr>
+          <w:lang w:val="en-US"/>
+        </w:rPr>
+        <w:t>`) REFERENCES `inversion` (`</w:t>
+      </w:r>
+      <w:proofErr w:type="spellStart"/>
+      <w:r>
+        <w:rPr>
+          <w:lang w:val="en-US"/>
+        </w:rPr>
+        <w:t>id_inversion</w:t>
+      </w:r>
+      <w:proofErr w:type="spellEnd"/>
+      <w:r>
+        <w:rPr>
+          <w:lang w:val="en-US"/>
+        </w:rPr>
+        <w:t>`),</w:t>
+      </w:r>
+    </w:p>
+    <w:p>
+      <w:pPr>
+        <w:spacing w:after="0" w:line="240" w:lineRule="auto"/>
+      </w:pPr>
+      <w:r>
+        <w:rPr>
+          <w:lang w:val="en-US"/>
+        </w:rPr>
+        <w:t xml:space="preserve">  </w:t>
+      </w:r>
+      <w:r>
+        <w:t>CONSTRAINT `</w:t>
+      </w:r>
+      <w:proofErr w:type="spellStart"/>
+      <w:r>
+        <w:t>fk_movimiento_tipo</w:t>
+      </w:r>
+      <w:proofErr w:type="spellEnd"/>
+      <w:r>
+        <w:t>` FOREIGN KEY (`</w:t>
+      </w:r>
+      <w:proofErr w:type="spellStart"/>
+      <w:r>
+        <w:t>id_tipo_movimiento</w:t>
+      </w:r>
+      <w:proofErr w:type="spellEnd"/>
+      <w:r>
+        <w:t>`) REFERENCES `</w:t>
+      </w:r>
+      <w:proofErr w:type="spellStart"/>
+      <w:r>
+        <w:t>catalogo_valor</w:t>
+      </w:r>
+      <w:proofErr w:type="spellEnd"/>
+      <w:r>
+        <w:t>` (`</w:t>
+      </w:r>
+      <w:proofErr w:type="spellStart"/>
+      <w:r>
+        <w:t>id_catalogo_valor</w:t>
+      </w:r>
+      <w:proofErr w:type="spellEnd"/>
+      <w:r>
+        <w:t>`),</w:t>
+      </w:r>
+    </w:p>
+    <w:p>
+      <w:pPr>
+        <w:spacing w:after="0" w:line="240" w:lineRule="auto"/>
+      </w:pPr>
+      <w:r>
+        <w:t xml:space="preserve">  CONSTRAINT `</w:t>
+      </w:r>
+      <w:proofErr w:type="spellStart"/>
+      <w:r>
+        <w:t>fk_movimiento_venta</w:t>
+      </w:r>
+      <w:proofErr w:type="spellEnd"/>
+      <w:r>
+        <w:t>` FOREIGN KEY (`</w:t>
+      </w:r>
+      <w:proofErr w:type="spellStart"/>
+      <w:r>
+        <w:t>id_venta_inversion</w:t>
+      </w:r>
+      <w:proofErr w:type="spellEnd"/>
+      <w:r>
+        <w:t>`) REFERENCES `</w:t>
+      </w:r>
+      <w:proofErr w:type="spellStart"/>
+      <w:r>
+        <w:t>venta_inversion</w:t>
+      </w:r>
+      <w:proofErr w:type="spellEnd"/>
+      <w:r>
+        <w:t>` (`</w:t>
+      </w:r>
+      <w:proofErr w:type="spellStart"/>
+      <w:r>
+        <w:t>id_venta_inversion</w:t>
+      </w:r>
+      <w:proofErr w:type="spellEnd"/>
+      <w:r>
+        <w:t>`)</w:t>
+      </w:r>
+    </w:p>
+    <w:p>
+      <w:pPr>
+        <w:spacing w:after="0" w:line="240" w:lineRule="auto"/>
+        <w:rPr>
+          <w:lang w:val="en-US"/>
+        </w:rPr>
+      </w:pPr>
+      <w:r>
+        <w:rPr>
+          <w:lang w:val="en-US"/>
+        </w:rPr>
+        <w:t>) ENGINE=</w:t>
+      </w:r>
+      <w:proofErr w:type="spellStart"/>
+      <w:r>
+        <w:rPr>
+          <w:lang w:val="en-US"/>
+        </w:rPr>
+        <w:t>InnoDB</w:t>
+      </w:r>
+      <w:proofErr w:type="spellEnd"/>
+      <w:r>
+        <w:rPr>
+          <w:lang w:val="en-US"/>
+        </w:rPr>
+        <w:t xml:space="preserve"> AUTO_INCREMENT=4 DEFAULT CHARSET=utf8mb4 COLLATE=utf8mb4_general_ci;</w:t>
+      </w:r>
+    </w:p>
+    <w:p>
+      <w:pPr>
+        <w:spacing w:after="0" w:line="240" w:lineRule="auto"/>
+        <w:rPr>
+          <w:lang w:val="en-US"/>
+        </w:rPr>
+      </w:pPr>
+    </w:p>
+    <w:p>
+      <w:pPr>
+        <w:spacing w:after="0" w:line="240" w:lineRule="auto"/>
+      </w:pPr>
+      <w:r>
+        <w:t>Creo que se debe a</w:t>
+      </w:r>
+      <w:r>
+        <w:t xml:space="preserve">ñadir </w:t>
+      </w:r>
+      <w:proofErr w:type="spellStart"/>
+      <w:r>
+        <w:t>id_persona</w:t>
+      </w:r>
+      <w:proofErr w:type="spellEnd"/>
+      <w:r>
+        <w:t xml:space="preserve"> a la tabla porque la contabilidad con la casa de valores se la lleva por cada inversionista. Al final se debe presentar </w:t>
+      </w:r>
+      <w:proofErr w:type="gramStart"/>
+      <w:r>
+        <w:t>una resultado</w:t>
+      </w:r>
+      <w:proofErr w:type="gramEnd"/>
+      <w:r>
+        <w:t xml:space="preserve"> como el siguiente:</w:t>
+      </w:r>
+    </w:p>
+    <w:p>
+      <w:pPr>
+        <w:spacing w:after="0" w:line="240" w:lineRule="auto"/>
+      </w:pPr>
+    </w:p>
+    <w:tbl>
+      <w:tblPr>
+        <w:tblW w:w="3592" w:type="dxa"/>
+        <w:tblCellMar>
+          <w:left w:w="70" w:type="dxa"/>
+          <w:right w:w="70" w:type="dxa"/>
+        </w:tblCellMar>
+        <w:tblLook w:val="04A0" w:firstRow="1" w:lastRow="0" w:firstColumn="1" w:lastColumn="0" w:noHBand="0" w:noVBand="1"/>
+      </w:tblPr>
+      <w:tblGrid>
+        <w:gridCol w:w="2096"/>
+        <w:gridCol w:w="1496"/>
+      </w:tblGrid>
+      <w:tr>
+        <w:trPr>
+          <w:trHeight w:val="300"/>
+        </w:trPr>
+        <w:tc>
+          <w:tcPr>
+            <w:tcW w:w="2096" w:type="dxa"/>
+            <w:tcBorders>
+              <w:top w:val="nil"/>
+              <w:left w:val="nil"/>
+              <w:bottom w:val="single" w:sz="4" w:space="0" w:color="95B3D7"/>
+              <w:right w:val="nil"/>
+            </w:tcBorders>
+            <w:shd w:val="clear" w:color="DCE6F1" w:fill="DCE6F1"/>
+            <w:noWrap/>
+            <w:vAlign w:val="bottom"/>
+            <w:hideMark/>
+          </w:tcPr>
+          <w:p>
+            <w:pPr>
+              <w:spacing w:after="0" w:line="240" w:lineRule="auto"/>
+              <w:rPr>
+                <w:rFonts w:ascii="Calibri" w:eastAsia="Times New Roman" w:hAnsi="Calibri" w:cs="Calibri"/>
+                <w:b/>
+                <w:bCs/>
+                <w:color w:val="000000"/>
+                <w:kern w:val="0"/>
+                <w:lang w:eastAsia="es-EC"/>
+                <w14:ligatures w14:val="none"/>
+              </w:rPr>
+            </w:pPr>
+            <w:r>
+              <w:rPr>
+                <w:rFonts w:ascii="Calibri" w:eastAsia="Times New Roman" w:hAnsi="Calibri" w:cs="Calibri"/>
+                <w:b/>
+                <w:bCs/>
+                <w:color w:val="000000"/>
+                <w:kern w:val="0"/>
+                <w:lang w:eastAsia="es-EC"/>
+                <w14:ligatures w14:val="none"/>
+              </w:rPr>
+              <w:t>Titular/Operación</w:t>
+            </w:r>
+          </w:p>
+        </w:tc>
+        <w:tc>
+          <w:tcPr>
+            <w:tcW w:w="1496" w:type="dxa"/>
+            <w:tcBorders>
+              <w:top w:val="nil"/>
+              <w:left w:val="nil"/>
+              <w:bottom w:val="single" w:sz="4" w:space="0" w:color="95B3D7"/>
+              <w:right w:val="nil"/>
+            </w:tcBorders>
+            <w:shd w:val="clear" w:color="DCE6F1" w:fill="DCE6F1"/>
+            <w:noWrap/>
+            <w:vAlign w:val="bottom"/>
+            <w:hideMark/>
+          </w:tcPr>
+          <w:p>
+            <w:pPr>
+              <w:spacing w:after="0" w:line="240" w:lineRule="auto"/>
+              <w:rPr>
+                <w:rFonts w:ascii="Calibri" w:eastAsia="Times New Roman" w:hAnsi="Calibri" w:cs="Calibri"/>
+                <w:b/>
+                <w:bCs/>
+                <w:color w:val="000000"/>
+                <w:kern w:val="0"/>
+                <w:lang w:eastAsia="es-EC"/>
+                <w14:ligatures w14:val="none"/>
+              </w:rPr>
+            </w:pPr>
+            <w:r>
+              <w:rPr>
+                <w:rFonts w:ascii="Calibri" w:eastAsia="Times New Roman" w:hAnsi="Calibri" w:cs="Calibri"/>
+                <w:b/>
+                <w:bCs/>
+                <w:color w:val="000000"/>
+                <w:kern w:val="0"/>
+                <w:lang w:eastAsia="es-EC"/>
+                <w14:ligatures w14:val="none"/>
+              </w:rPr>
+              <w:t>Suma de Valor</w:t>
+            </w:r>
+          </w:p>
+        </w:tc>
+      </w:tr>
+      <w:tr>
+        <w:trPr>
+          <w:trHeight w:val="300"/>
+        </w:trPr>
+        <w:tc>
+          <w:tcPr>
+            <w:tcW w:w="2096" w:type="dxa"/>
+            <w:tcBorders>
+              <w:top w:val="nil"/>
+              <w:left w:val="nil"/>
+              <w:bottom w:val="single" w:sz="4" w:space="0" w:color="95B3D7"/>
+              <w:right w:val="nil"/>
+            </w:tcBorders>
+            <w:shd w:val="clear" w:color="auto" w:fill="auto"/>
+            <w:noWrap/>
+            <w:vAlign w:val="bottom"/>
+            <w:hideMark/>
+          </w:tcPr>
+          <w:p>
+            <w:pPr>
+              <w:spacing w:after="0" w:line="240" w:lineRule="auto"/>
+              <w:rPr>
+                <w:rFonts w:ascii="Calibri" w:eastAsia="Times New Roman" w:hAnsi="Calibri" w:cs="Calibri"/>
+                <w:b/>
+                <w:bCs/>
+                <w:color w:val="000000"/>
+                <w:kern w:val="0"/>
+                <w:lang w:eastAsia="es-EC"/>
+                <w14:ligatures w14:val="none"/>
+              </w:rPr>
+            </w:pPr>
+            <w:r>
+              <w:rPr>
+                <w:rFonts w:ascii="Calibri" w:eastAsia="Times New Roman" w:hAnsi="Calibri" w:cs="Calibri"/>
+                <w:b/>
+                <w:bCs/>
+                <w:color w:val="000000"/>
+                <w:kern w:val="0"/>
+                <w:lang w:eastAsia="es-EC"/>
+                <w14:ligatures w14:val="none"/>
+              </w:rPr>
+              <w:t>Argentina</w:t>
+            </w:r>
+          </w:p>
+        </w:tc>
+        <w:tc>
+          <w:tcPr>
+            <w:tcW w:w="1496" w:type="dxa"/>
+            <w:tcBorders>
+              <w:top w:val="nil"/>
+              <w:left w:val="nil"/>
+              <w:bottom w:val="single" w:sz="4" w:space="0" w:color="95B3D7"/>
+              <w:right w:val="nil"/>
+            </w:tcBorders>
+            <w:shd w:val="clear" w:color="auto" w:fill="auto"/>
+            <w:noWrap/>
+            <w:vAlign w:val="bottom"/>
+            <w:hideMark/>
+          </w:tcPr>
+          <w:p>
+            <w:pPr>
+              <w:spacing w:after="0" w:line="240" w:lineRule="auto"/>
+              <w:jc w:val="right"/>
+              <w:rPr>
+                <w:rFonts w:ascii="Calibri" w:eastAsia="Times New Roman" w:hAnsi="Calibri" w:cs="Calibri"/>
+                <w:b/>
+                <w:bCs/>
+                <w:color w:val="000000"/>
+                <w:kern w:val="0"/>
+                <w:lang w:eastAsia="es-EC"/>
+                <w14:ligatures w14:val="none"/>
+              </w:rPr>
+            </w:pPr>
+            <w:r>
+              <w:rPr>
+                <w:rFonts w:ascii="Calibri" w:eastAsia="Times New Roman" w:hAnsi="Calibri" w:cs="Calibri"/>
+                <w:b/>
+                <w:bCs/>
+                <w:color w:val="000000"/>
+                <w:kern w:val="0"/>
+                <w:lang w:eastAsia="es-EC"/>
+                <w14:ligatures w14:val="none"/>
+              </w:rPr>
+              <w:t>$0,00</w:t>
+            </w:r>
+          </w:p>
+        </w:tc>
+      </w:tr>
+      <w:tr>
+        <w:trPr>
+          <w:trHeight w:val="300"/>
+        </w:trPr>
+        <w:tc>
+          <w:tcPr>
+            <w:tcW w:w="2096" w:type="dxa"/>
+            <w:tcBorders>
+              <w:top w:val="nil"/>
+              <w:left w:val="nil"/>
+              <w:bottom w:val="single" w:sz="4" w:space="0" w:color="95B3D7"/>
+              <w:right w:val="nil"/>
+            </w:tcBorders>
+            <w:shd w:val="clear" w:color="auto" w:fill="auto"/>
+            <w:noWrap/>
+            <w:vAlign w:val="bottom"/>
+            <w:hideMark/>
+          </w:tcPr>
+          <w:p>
+            <w:pPr>
+              <w:spacing w:after="0" w:line="240" w:lineRule="auto"/>
+              <w:rPr>
+                <w:rFonts w:ascii="Calibri" w:eastAsia="Times New Roman" w:hAnsi="Calibri" w:cs="Calibri"/>
+                <w:b/>
+                <w:bCs/>
+                <w:color w:val="000000"/>
+                <w:kern w:val="0"/>
+                <w:lang w:eastAsia="es-EC"/>
+                <w14:ligatures w14:val="none"/>
+              </w:rPr>
+            </w:pPr>
+            <w:r>
+              <w:rPr>
+                <w:rFonts w:ascii="Calibri" w:eastAsia="Times New Roman" w:hAnsi="Calibri" w:cs="Calibri"/>
+                <w:b/>
+                <w:bCs/>
+                <w:color w:val="000000"/>
+                <w:kern w:val="0"/>
+                <w:lang w:eastAsia="es-EC"/>
+                <w14:ligatures w14:val="none"/>
+              </w:rPr>
+              <w:t>Cristian</w:t>
+            </w:r>
+          </w:p>
+        </w:tc>
+        <w:tc>
+          <w:tcPr>
+            <w:tcW w:w="1496" w:type="dxa"/>
+            <w:tcBorders>
+              <w:top w:val="nil"/>
+              <w:left w:val="nil"/>
+              <w:bottom w:val="single" w:sz="4" w:space="0" w:color="95B3D7"/>
+              <w:right w:val="nil"/>
+            </w:tcBorders>
+            <w:shd w:val="clear" w:color="auto" w:fill="auto"/>
+            <w:noWrap/>
+            <w:vAlign w:val="bottom"/>
+            <w:hideMark/>
+          </w:tcPr>
+          <w:p>
+            <w:pPr>
+              <w:spacing w:after="0" w:line="240" w:lineRule="auto"/>
+              <w:jc w:val="right"/>
+              <w:rPr>
+                <w:rFonts w:ascii="Calibri" w:eastAsia="Times New Roman" w:hAnsi="Calibri" w:cs="Calibri"/>
+                <w:b/>
+                <w:bCs/>
+                <w:color w:val="1F497D"/>
+                <w:kern w:val="0"/>
+                <w:lang w:eastAsia="es-EC"/>
+                <w14:ligatures w14:val="none"/>
+              </w:rPr>
+            </w:pPr>
+            <w:r>
+              <w:rPr>
+                <w:rFonts w:ascii="Calibri" w:eastAsia="Times New Roman" w:hAnsi="Calibri" w:cs="Calibri"/>
+                <w:b/>
+                <w:bCs/>
+                <w:color w:val="1F497D"/>
+                <w:kern w:val="0"/>
+                <w:lang w:eastAsia="es-EC"/>
+                <w14:ligatures w14:val="none"/>
+              </w:rPr>
+              <w:t>$179,83</w:t>
+            </w:r>
+          </w:p>
+        </w:tc>
+      </w:tr>
+      <w:tr>
+        <w:trPr>
+          <w:trHeight w:val="300"/>
+        </w:trPr>
+        <w:tc>
+          <w:tcPr>
+            <w:tcW w:w="2096" w:type="dxa"/>
+            <w:tcBorders>
+              <w:top w:val="nil"/>
+              <w:left w:val="nil"/>
+              <w:bottom w:val="single" w:sz="4" w:space="0" w:color="95B3D7"/>
+              <w:right w:val="nil"/>
+            </w:tcBorders>
+            <w:shd w:val="clear" w:color="auto" w:fill="auto"/>
+            <w:noWrap/>
+            <w:vAlign w:val="bottom"/>
+            <w:hideMark/>
+          </w:tcPr>
+          <w:p>
+            <w:pPr>
+              <w:spacing w:after="0" w:line="240" w:lineRule="auto"/>
+              <w:rPr>
+                <w:rFonts w:ascii="Calibri" w:eastAsia="Times New Roman" w:hAnsi="Calibri" w:cs="Calibri"/>
+                <w:b/>
+                <w:bCs/>
+                <w:color w:val="000000"/>
+                <w:kern w:val="0"/>
+                <w:lang w:eastAsia="es-EC"/>
+                <w14:ligatures w14:val="none"/>
+              </w:rPr>
+            </w:pPr>
+            <w:r>
+              <w:rPr>
+                <w:rFonts w:ascii="Calibri" w:eastAsia="Times New Roman" w:hAnsi="Calibri" w:cs="Calibri"/>
+                <w:b/>
+                <w:bCs/>
+                <w:color w:val="000000"/>
+                <w:kern w:val="0"/>
+                <w:lang w:eastAsia="es-EC"/>
+                <w14:ligatures w14:val="none"/>
+              </w:rPr>
+              <w:t>Isabel</w:t>
+            </w:r>
+          </w:p>
+        </w:tc>
+        <w:tc>
+          <w:tcPr>
+            <w:tcW w:w="1496" w:type="dxa"/>
+            <w:tcBorders>
+              <w:top w:val="nil"/>
+              <w:left w:val="nil"/>
+              <w:bottom w:val="single" w:sz="4" w:space="0" w:color="95B3D7"/>
+              <w:right w:val="nil"/>
+            </w:tcBorders>
+            <w:shd w:val="clear" w:color="auto" w:fill="auto"/>
+            <w:noWrap/>
+            <w:vAlign w:val="bottom"/>
+            <w:hideMark/>
+          </w:tcPr>
+          <w:p>
+            <w:pPr>
+              <w:spacing w:after="0" w:line="240" w:lineRule="auto"/>
+              <w:jc w:val="right"/>
+              <w:rPr>
+                <w:rFonts w:ascii="Calibri" w:eastAsia="Times New Roman" w:hAnsi="Calibri" w:cs="Calibri"/>
+                <w:b/>
+                <w:bCs/>
+                <w:color w:val="1F497D"/>
+                <w:kern w:val="0"/>
+                <w:lang w:eastAsia="es-EC"/>
+                <w14:ligatures w14:val="none"/>
+              </w:rPr>
+            </w:pPr>
+            <w:r>
+              <w:rPr>
+                <w:rFonts w:ascii="Calibri" w:eastAsia="Times New Roman" w:hAnsi="Calibri" w:cs="Calibri"/>
+                <w:b/>
+                <w:bCs/>
+                <w:color w:val="1F497D"/>
+                <w:kern w:val="0"/>
+                <w:lang w:eastAsia="es-EC"/>
+                <w14:ligatures w14:val="none"/>
+              </w:rPr>
+              <w:t>$6.963,36</w:t>
+            </w:r>
+          </w:p>
+        </w:tc>
+      </w:tr>
+      <w:tr>
+        <w:trPr>
+          <w:trHeight w:val="300"/>
+        </w:trPr>
+        <w:tc>
+          <w:tcPr>
+            <w:tcW w:w="2096" w:type="dxa"/>
+            <w:tcBorders>
+              <w:top w:val="nil"/>
+              <w:left w:val="nil"/>
+              <w:bottom w:val="single" w:sz="4" w:space="0" w:color="95B3D7"/>
+              <w:right w:val="nil"/>
+            </w:tcBorders>
+            <w:shd w:val="clear" w:color="auto" w:fill="auto"/>
+            <w:noWrap/>
+            <w:vAlign w:val="bottom"/>
+            <w:hideMark/>
+          </w:tcPr>
+          <w:p>
+            <w:pPr>
+              <w:spacing w:after="0" w:line="240" w:lineRule="auto"/>
+              <w:rPr>
+                <w:rFonts w:ascii="Calibri" w:eastAsia="Times New Roman" w:hAnsi="Calibri" w:cs="Calibri"/>
+                <w:b/>
+                <w:bCs/>
+                <w:color w:val="000000"/>
+                <w:kern w:val="0"/>
+                <w:lang w:eastAsia="es-EC"/>
+                <w14:ligatures w14:val="none"/>
+              </w:rPr>
+            </w:pPr>
+            <w:r>
+              <w:rPr>
+                <w:rFonts w:ascii="Calibri" w:eastAsia="Times New Roman" w:hAnsi="Calibri" w:cs="Calibri"/>
+                <w:b/>
+                <w:bCs/>
+                <w:color w:val="000000"/>
+                <w:kern w:val="0"/>
+                <w:lang w:eastAsia="es-EC"/>
+                <w14:ligatures w14:val="none"/>
+              </w:rPr>
+              <w:t>Jhon</w:t>
+            </w:r>
+          </w:p>
+        </w:tc>
+        <w:tc>
+          <w:tcPr>
+            <w:tcW w:w="1496" w:type="dxa"/>
+            <w:tcBorders>
+              <w:top w:val="nil"/>
+              <w:left w:val="nil"/>
+              <w:bottom w:val="single" w:sz="4" w:space="0" w:color="95B3D7"/>
+              <w:right w:val="nil"/>
+            </w:tcBorders>
+            <w:shd w:val="clear" w:color="auto" w:fill="auto"/>
+            <w:noWrap/>
+            <w:vAlign w:val="bottom"/>
+            <w:hideMark/>
+          </w:tcPr>
+          <w:p>
+            <w:pPr>
+              <w:spacing w:after="0" w:line="240" w:lineRule="auto"/>
+              <w:jc w:val="right"/>
+              <w:rPr>
+                <w:rFonts w:ascii="Calibri" w:eastAsia="Times New Roman" w:hAnsi="Calibri" w:cs="Calibri"/>
+                <w:b/>
+                <w:bCs/>
+                <w:color w:val="1F497D"/>
+                <w:kern w:val="0"/>
+                <w:lang w:eastAsia="es-EC"/>
+                <w14:ligatures w14:val="none"/>
+              </w:rPr>
+            </w:pPr>
+            <w:r>
+              <w:rPr>
+                <w:rFonts w:ascii="Calibri" w:eastAsia="Times New Roman" w:hAnsi="Calibri" w:cs="Calibri"/>
+                <w:b/>
+                <w:bCs/>
+                <w:color w:val="1F497D"/>
+                <w:kern w:val="0"/>
+                <w:lang w:eastAsia="es-EC"/>
+                <w14:ligatures w14:val="none"/>
+              </w:rPr>
+              <w:t>$31.009,11</w:t>
+            </w:r>
+          </w:p>
+        </w:tc>
+      </w:tr>
+      <w:tr>
+        <w:trPr>
+          <w:trHeight w:val="300"/>
+        </w:trPr>
+        <w:tc>
+          <w:tcPr>
+            <w:tcW w:w="2096" w:type="dxa"/>
+            <w:tcBorders>
+              <w:top w:val="single" w:sz="4" w:space="0" w:color="95B3D7"/>
+              <w:left w:val="nil"/>
+              <w:bottom w:val="nil"/>
+              <w:right w:val="nil"/>
+            </w:tcBorders>
+            <w:shd w:val="clear" w:color="DCE6F1" w:fill="DCE6F1"/>
+            <w:noWrap/>
+            <w:vAlign w:val="bottom"/>
+            <w:hideMark/>
+          </w:tcPr>
+          <w:p>
+            <w:pPr>
+              <w:spacing w:after="0" w:line="240" w:lineRule="auto"/>
+              <w:rPr>
+                <w:rFonts w:ascii="Calibri" w:eastAsia="Times New Roman" w:hAnsi="Calibri" w:cs="Calibri"/>
+                <w:b/>
+                <w:bCs/>
+                <w:color w:val="000000"/>
+                <w:kern w:val="0"/>
+                <w:lang w:eastAsia="es-EC"/>
+                <w14:ligatures w14:val="none"/>
+              </w:rPr>
+            </w:pPr>
+            <w:proofErr w:type="gramStart"/>
+            <w:r>
+              <w:rPr>
+                <w:rFonts w:ascii="Calibri" w:eastAsia="Times New Roman" w:hAnsi="Calibri" w:cs="Calibri"/>
+                <w:b/>
+                <w:bCs/>
+                <w:color w:val="000000"/>
+                <w:kern w:val="0"/>
+                <w:lang w:eastAsia="es-EC"/>
+                <w14:ligatures w14:val="none"/>
+              </w:rPr>
+              <w:t>Total</w:t>
+            </w:r>
+            <w:proofErr w:type="gramEnd"/>
+            <w:r>
+              <w:rPr>
+                <w:rFonts w:ascii="Calibri" w:eastAsia="Times New Roman" w:hAnsi="Calibri" w:cs="Calibri"/>
+                <w:b/>
+                <w:bCs/>
+                <w:color w:val="000000"/>
+                <w:kern w:val="0"/>
+                <w:lang w:eastAsia="es-EC"/>
+                <w14:ligatures w14:val="none"/>
+              </w:rPr>
+              <w:t xml:space="preserve"> general</w:t>
+            </w:r>
+          </w:p>
+        </w:tc>
+        <w:tc>
+          <w:tcPr>
+            <w:tcW w:w="1496" w:type="dxa"/>
+            <w:tcBorders>
+              <w:top w:val="single" w:sz="4" w:space="0" w:color="95B3D7"/>
+              <w:left w:val="nil"/>
+              <w:bottom w:val="nil"/>
+              <w:right w:val="nil"/>
+            </w:tcBorders>
+            <w:shd w:val="clear" w:color="DCE6F1" w:fill="DCE6F1"/>
+            <w:noWrap/>
+            <w:vAlign w:val="bottom"/>
+            <w:hideMark/>
+          </w:tcPr>
+          <w:p>
+            <w:pPr>
+              <w:spacing w:after="0" w:line="240" w:lineRule="auto"/>
+              <w:jc w:val="right"/>
+              <w:rPr>
+                <w:rFonts w:ascii="Calibri" w:eastAsia="Times New Roman" w:hAnsi="Calibri" w:cs="Calibri"/>
+                <w:b/>
+                <w:bCs/>
+                <w:color w:val="1F497D"/>
+                <w:kern w:val="0"/>
+                <w:lang w:eastAsia="es-EC"/>
+                <w14:ligatures w14:val="none"/>
+              </w:rPr>
+            </w:pPr>
+            <w:r>
+              <w:rPr>
+                <w:rFonts w:ascii="Calibri" w:eastAsia="Times New Roman" w:hAnsi="Calibri" w:cs="Calibri"/>
+                <w:b/>
+                <w:bCs/>
+                <w:color w:val="1F497D"/>
+                <w:kern w:val="0"/>
+                <w:lang w:eastAsia="es-EC"/>
+                <w14:ligatures w14:val="none"/>
+              </w:rPr>
+              <w:t>$38.152,30</w:t>
+            </w:r>
+          </w:p>
+        </w:tc>
+      </w:tr>
+    </w:tbl>
+    <w:p>
+      <w:pPr>
+        <w:spacing w:after="0" w:line="240" w:lineRule="auto"/>
+      </w:pPr>
+    </w:p>
+    <w:p>
+      <w:pPr>
+        <w:spacing w:after="0" w:line="240" w:lineRule="auto"/>
+      </w:pPr>
+    </w:p>
+    <w:p>
+      <w:pPr>
+        <w:spacing w:after="0" w:line="240" w:lineRule="auto"/>
+      </w:pPr>
+    </w:p>
+    <w:p>
+      <w:pPr>
+        <w:spacing w:after="0" w:line="240" w:lineRule="auto"/>
+      </w:pPr>
+    </w:p>
+    <w:p>
+      <w:pPr>
+        <w:spacing w:after="0" w:line="240" w:lineRule="auto"/>
+      </w:pPr>
+    </w:p>
+    <w:p>
+      <w:pPr>
+        <w:spacing w:after="0" w:line="240" w:lineRule="auto"/>
+      </w:pPr>
+    </w:p>
+    <w:p>
+      <w:pPr>
+        <w:spacing w:after="0" w:line="240" w:lineRule="auto"/>
+      </w:pPr>
+    </w:p>
+    <w:p>
+      <w:pPr>
+        <w:spacing w:after="0" w:line="240" w:lineRule="auto"/>
+      </w:pPr>
+      <w:r>
+        <w:t>Cada vez que se abre la pantalla "Otros Valores"</w:t>
+      </w:r>
+      <w:r>
+        <w:t>,</w:t>
+      </w:r>
+      <w:r>
+        <w:t xml:space="preserve"> </w:t>
+      </w:r>
+      <w:r>
+        <w:t>n</w:t>
+      </w:r>
+      <w:r>
+        <w:t xml:space="preserve">ecesito que se calcule el saldo por persona y se actualice la tabla </w:t>
+      </w:r>
+      <w:proofErr w:type="spellStart"/>
+      <w:r>
+        <w:t>otro_valor</w:t>
+      </w:r>
+      <w:proofErr w:type="spellEnd"/>
+      <w:r>
+        <w:t xml:space="preserve"> de la siguiente manera:</w:t>
+      </w:r>
+    </w:p>
+    <w:p>
+      <w:pPr>
+        <w:spacing w:after="0" w:line="240" w:lineRule="auto"/>
+      </w:pPr>
+    </w:p>
+    <w:p>
+      <w:pPr>
+        <w:spacing w:after="0" w:line="240" w:lineRule="auto"/>
+      </w:pPr>
+      <w:r>
+        <w:t xml:space="preserve">El Saldo del propietario con código 5 (Argentina) </w:t>
+      </w:r>
+      <w:r>
+        <w:t>s</w:t>
+      </w:r>
+      <w:r>
+        <w:t xml:space="preserve">e debe colocar en el registro </w:t>
+      </w:r>
+      <w:r>
+        <w:t xml:space="preserve">de </w:t>
+      </w:r>
+      <w:proofErr w:type="spellStart"/>
+      <w:r>
+        <w:t>otro_valor</w:t>
+      </w:r>
+      <w:proofErr w:type="spellEnd"/>
+      <w:r>
+        <w:t xml:space="preserve"> </w:t>
+      </w:r>
+      <w:r>
+        <w:t xml:space="preserve">donde </w:t>
+      </w:r>
+      <w:proofErr w:type="spellStart"/>
+      <w:r>
+        <w:t>id_tipo_otro_valor</w:t>
+      </w:r>
+      <w:proofErr w:type="spellEnd"/>
+      <w:r>
+        <w:t xml:space="preserve"> =142</w:t>
+      </w:r>
+    </w:p>
+    <w:p>
+      <w:pPr>
+        <w:spacing w:after="0" w:line="240" w:lineRule="auto"/>
+      </w:pPr>
+    </w:p>
+    <w:p>
+      <w:pPr>
+        <w:spacing w:after="0" w:line="240" w:lineRule="auto"/>
+      </w:pPr>
+      <w:r>
+        <w:t xml:space="preserve">El Saldo del propietario con código </w:t>
+      </w:r>
+      <w:r>
+        <w:t>2</w:t>
+      </w:r>
+      <w:r>
+        <w:t xml:space="preserve"> (</w:t>
+      </w:r>
+      <w:r>
+        <w:t>Cristian</w:t>
+      </w:r>
+      <w:r>
+        <w:t xml:space="preserve">) </w:t>
+      </w:r>
+      <w:r>
+        <w:t>s</w:t>
+      </w:r>
+      <w:r>
+        <w:t xml:space="preserve">e debe colocar en el registro </w:t>
+      </w:r>
+      <w:r>
+        <w:t xml:space="preserve">de </w:t>
+      </w:r>
+      <w:proofErr w:type="spellStart"/>
+      <w:r>
+        <w:t>otro_valor</w:t>
+      </w:r>
+      <w:proofErr w:type="spellEnd"/>
+      <w:r>
+        <w:t xml:space="preserve"> </w:t>
+      </w:r>
+      <w:r>
+        <w:t xml:space="preserve">donde </w:t>
+      </w:r>
+      <w:proofErr w:type="spellStart"/>
+      <w:r>
+        <w:t>id_tipo_otro_valor</w:t>
+      </w:r>
+      <w:proofErr w:type="spellEnd"/>
+      <w:r>
+        <w:t xml:space="preserve"> =14</w:t>
+      </w:r>
+      <w:r>
+        <w:t>3</w:t>
+      </w:r>
+    </w:p>
+    <w:p>
+      <w:pPr>
+        <w:spacing w:after="0" w:line="240" w:lineRule="auto"/>
+      </w:pPr>
+    </w:p>
+    <w:p>
+      <w:pPr>
+        <w:spacing w:after="0" w:line="240" w:lineRule="auto"/>
+      </w:pPr>
+      <w:r>
+        <w:t xml:space="preserve">El Saldo del propietario con código </w:t>
+      </w:r>
+      <w:r>
+        <w:t>3</w:t>
+      </w:r>
+      <w:r>
+        <w:t xml:space="preserve"> (</w:t>
+      </w:r>
+      <w:r>
+        <w:t>Cristian</w:t>
+      </w:r>
+      <w:r>
+        <w:t xml:space="preserve">) </w:t>
+      </w:r>
+      <w:r>
+        <w:t>s</w:t>
+      </w:r>
+      <w:r>
+        <w:t xml:space="preserve">e debe colocar en el registro </w:t>
+      </w:r>
+      <w:r>
+        <w:t xml:space="preserve">de </w:t>
+      </w:r>
+      <w:proofErr w:type="spellStart"/>
+      <w:r>
+        <w:t>otro_valor</w:t>
+      </w:r>
+      <w:proofErr w:type="spellEnd"/>
+      <w:r>
+        <w:t xml:space="preserve"> </w:t>
+      </w:r>
+      <w:r>
+        <w:t xml:space="preserve">donde </w:t>
+      </w:r>
+      <w:proofErr w:type="spellStart"/>
+      <w:r>
+        <w:t>id_tipo_otro_valor</w:t>
+      </w:r>
+      <w:proofErr w:type="spellEnd"/>
+      <w:r>
+        <w:t xml:space="preserve"> =14</w:t>
+      </w:r>
+      <w:r>
+        <w:t>4</w:t>
+      </w:r>
+    </w:p>
+    <w:p>
+      <w:pPr>
+        <w:spacing w:after="0" w:line="240" w:lineRule="auto"/>
+      </w:pPr>
+    </w:p>
+    <w:p>
+      <w:pPr>
+        <w:spacing w:after="0" w:line="240" w:lineRule="auto"/>
+      </w:pPr>
+      <w:r>
+        <w:t xml:space="preserve">El Saldo del propietario con código </w:t>
+      </w:r>
+      <w:r>
+        <w:t>1</w:t>
+      </w:r>
+      <w:r>
+        <w:t xml:space="preserve"> (</w:t>
+      </w:r>
+      <w:r>
+        <w:t>Cristian</w:t>
+      </w:r>
+      <w:r>
+        <w:t xml:space="preserve">) </w:t>
+      </w:r>
+      <w:r>
+        <w:t>s</w:t>
+      </w:r>
+      <w:r>
+        <w:t xml:space="preserve">e debe colocar en el registro </w:t>
+      </w:r>
+      <w:r>
+        <w:t xml:space="preserve">de </w:t>
+      </w:r>
+      <w:proofErr w:type="spellStart"/>
+      <w:r>
+        <w:t>otro_valor</w:t>
+      </w:r>
+      <w:proofErr w:type="spellEnd"/>
+      <w:r>
+        <w:t xml:space="preserve"> </w:t>
+      </w:r>
+      <w:r>
+        <w:t xml:space="preserve">donde </w:t>
+      </w:r>
+      <w:proofErr w:type="spellStart"/>
+      <w:r>
+        <w:t>id_tipo_otro_valor</w:t>
+      </w:r>
+      <w:proofErr w:type="spellEnd"/>
+      <w:r>
+        <w:t xml:space="preserve"> =14</w:t>
+      </w:r>
+      <w:r>
+        <w:t>5</w:t>
+      </w:r>
+    </w:p>
+    <w:p>
+      <w:pPr>
+        <w:spacing w:after="0" w:line="240" w:lineRule="auto"/>
+      </w:pPr>
+    </w:p>
+    <w:p>
+      <w:pPr>
+        <w:spacing w:after="0" w:line="240" w:lineRule="auto"/>
+      </w:pPr>
+      <w:r>
+        <w:t>Después de realizar la actualización se debe renderizar la pantalla “Otros Valores”</w:t>
+      </w:r>
+    </w:p>
+    <w:p>
+      <w:pPr>
+        <w:spacing w:after="0" w:line="240" w:lineRule="auto"/>
+      </w:pPr>
+    </w:p>
+    <w:p>
+      <w:pPr>
+        <w:spacing w:after="0" w:line="240" w:lineRule="auto"/>
+      </w:pPr>
+    </w:p>
+    <w:p>
+      <w:pPr>
+        <w:spacing w:after="0" w:line="240" w:lineRule="auto"/>
+      </w:pPr>
+    </w:p>
+    <w:p>
+      <w:pPr>
+        <w:spacing w:after="0" w:line="240" w:lineRule="auto"/>
+      </w:pPr>
+      <w:r>
+        <w:t xml:space="preserve">En la tabla </w:t>
+      </w:r>
+      <w:proofErr w:type="spellStart"/>
+      <w:r>
+        <w:t>otro_valor</w:t>
+      </w:r>
+      <w:proofErr w:type="spellEnd"/>
+      <w:r>
+        <w:t xml:space="preserve"> </w:t>
+      </w:r>
+      <w:r>
+        <w:t>e</w:t>
+      </w:r>
+      <w:r>
+        <w:t xml:space="preserve">xisten ciertos </w:t>
+      </w:r>
+      <w:r>
+        <w:t>registros</w:t>
+      </w:r>
+      <w:r>
+        <w:t xml:space="preserve"> en donde almaceno el saldo que mantengo en la Casa de Valores Santa Fe. Cada vez que se realiza una </w:t>
+      </w:r>
+      <w:proofErr w:type="spellStart"/>
+      <w:r>
+        <w:t>actualizacion</w:t>
+      </w:r>
+      <w:proofErr w:type="spellEnd"/>
+      <w:r>
+        <w:t xml:space="preserve"> en la tabla </w:t>
+      </w:r>
+      <w:proofErr w:type="spellStart"/>
+      <w:r>
+        <w:t>movimi</w:t>
+      </w:r>
+      <w:r>
+        <w:t>e</w:t>
+      </w:r>
+      <w:r>
+        <w:t>nto</w:t>
+      </w:r>
+      <w:r>
+        <w:t>_</w:t>
+      </w:r>
+      <w:r>
+        <w:t>capital</w:t>
+      </w:r>
+      <w:proofErr w:type="spellEnd"/>
+    </w:p>
+    <w:p>
+      <w:pPr>
+        <w:spacing w:after="0" w:line="240" w:lineRule="auto"/>
+      </w:pPr>
+    </w:p>
+    <w:p>
+      <w:pPr>
+        <w:spacing w:after="0" w:line="240" w:lineRule="auto"/>
+      </w:pPr>
+    </w:p>
+    <w:p>
+      <w:pPr>
+        <w:spacing w:after="0" w:line="240" w:lineRule="auto"/>
+      </w:pPr>
+    </w:p>
+    <w:p>
+      <w:pPr>
+        <w:spacing w:after="0" w:line="240" w:lineRule="auto"/>
+      </w:pPr>
+      <w:r>
+        <w:t xml:space="preserve">Si </w:t>
+      </w:r>
+      <w:proofErr w:type="spellStart"/>
+      <w:r>
+        <w:t>id_persona</w:t>
+      </w:r>
+      <w:proofErr w:type="spellEnd"/>
+      <w:r>
+        <w:t xml:space="preserve"> = 1 se debe ejecutar la siguiente sentencia:</w:t>
+      </w:r>
+    </w:p>
+    <w:p>
+      <w:pPr>
+        <w:spacing w:after="0" w:line="240" w:lineRule="auto"/>
+      </w:pPr>
+      <w:r>
+        <w:t>UPDATE `sipro_</w:t>
+      </w:r>
+      <w:proofErr w:type="spellStart"/>
+      <w:r>
+        <w:t>desa</w:t>
+      </w:r>
+      <w:proofErr w:type="spellEnd"/>
+      <w:proofErr w:type="gramStart"/>
+      <w:r>
+        <w:t>`.`</w:t>
+      </w:r>
+      <w:proofErr w:type="spellStart"/>
+      <w:proofErr w:type="gramEnd"/>
+      <w:r>
+        <w:t>otro_valor</w:t>
+      </w:r>
+      <w:proofErr w:type="spellEnd"/>
+      <w:r>
+        <w:t>`</w:t>
+      </w:r>
+    </w:p>
+    <w:p>
+      <w:pPr>
+        <w:spacing w:after="0" w:line="240" w:lineRule="auto"/>
+      </w:pPr>
+      <w:r>
+        <w:t>SET</w:t>
+      </w:r>
+    </w:p>
+    <w:p>
+      <w:pPr>
+        <w:spacing w:after="0" w:line="240" w:lineRule="auto"/>
+      </w:pPr>
+      <w:r>
+        <w:t xml:space="preserve">`valor` = `valor` + </w:t>
+      </w:r>
+      <w:proofErr w:type="gramStart"/>
+      <w:r>
+        <w:t>monto  si</w:t>
+      </w:r>
+      <w:proofErr w:type="gramEnd"/>
+      <w:r>
+        <w:t xml:space="preserve"> signo = 190  o   `valor` = `valor`-monto si signo=191</w:t>
+      </w:r>
+    </w:p>
+    <w:p>
+      <w:pPr>
+        <w:spacing w:after="0" w:line="240" w:lineRule="auto"/>
+      </w:pPr>
+      <w:r>
+        <w:t>WHERE `</w:t>
+      </w:r>
+      <w:proofErr w:type="spellStart"/>
+      <w:r>
+        <w:t>id_otro_valor</w:t>
+      </w:r>
+      <w:proofErr w:type="spellEnd"/>
+      <w:r>
+        <w:t>` = 145;</w:t>
+      </w:r>
+    </w:p>
+    <w:p>
+      <w:pPr>
+        <w:spacing w:after="0" w:line="240" w:lineRule="auto"/>
+      </w:pPr>
+      <w:r>
+        <w:t xml:space="preserve"> </w:t>
+      </w:r>
+    </w:p>
+    <w:p>
+      <w:pPr>
+        <w:spacing w:after="0" w:line="240" w:lineRule="auto"/>
+      </w:pPr>
+    </w:p>
+    <w:p>
+      <w:pPr>
+        <w:spacing w:after="0" w:line="240" w:lineRule="auto"/>
+      </w:pPr>
+      <w:r>
+        <w:t xml:space="preserve">Si </w:t>
+      </w:r>
+      <w:proofErr w:type="spellStart"/>
+      <w:r>
+        <w:t>id_persona</w:t>
+      </w:r>
+      <w:proofErr w:type="spellEnd"/>
+      <w:r>
+        <w:t xml:space="preserve"> = 2 se debe ejecutar la siguiente sentencia:</w:t>
+      </w:r>
+    </w:p>
+    <w:p>
+      <w:pPr>
+        <w:spacing w:after="0" w:line="240" w:lineRule="auto"/>
+      </w:pPr>
+      <w:r>
+        <w:t>UPDATE `sipro_</w:t>
+      </w:r>
+      <w:proofErr w:type="spellStart"/>
+      <w:r>
+        <w:t>desa</w:t>
+      </w:r>
+      <w:proofErr w:type="spellEnd"/>
+      <w:proofErr w:type="gramStart"/>
+      <w:r>
+        <w:t>`.`</w:t>
+      </w:r>
+      <w:proofErr w:type="spellStart"/>
+      <w:proofErr w:type="gramEnd"/>
+      <w:r>
+        <w:t>otro_valor</w:t>
+      </w:r>
+      <w:proofErr w:type="spellEnd"/>
+      <w:r>
+        <w:t>`</w:t>
+      </w:r>
+    </w:p>
+    <w:p>
+      <w:pPr>
+        <w:spacing w:after="0" w:line="240" w:lineRule="auto"/>
+      </w:pPr>
+      <w:r>
+        <w:lastRenderedPageBreak/>
+        <w:t>SET</w:t>
+      </w:r>
+    </w:p>
+    <w:p>
+      <w:pPr>
+        <w:spacing w:after="0" w:line="240" w:lineRule="auto"/>
+      </w:pPr>
+      <w:r>
+        <w:t xml:space="preserve">`valor` = `valor` + </w:t>
+      </w:r>
+      <w:proofErr w:type="gramStart"/>
+      <w:r>
+        <w:t>monto  si</w:t>
+      </w:r>
+      <w:proofErr w:type="gramEnd"/>
+      <w:r>
+        <w:t xml:space="preserve"> signo = 190  o   `valor` = `valor`-monto si signo=191</w:t>
+      </w:r>
+    </w:p>
+    <w:p>
+      <w:pPr>
+        <w:spacing w:after="0" w:line="240" w:lineRule="auto"/>
+      </w:pPr>
+      <w:r>
+        <w:t>WHERE `</w:t>
+      </w:r>
+      <w:proofErr w:type="spellStart"/>
+      <w:r>
+        <w:t>id_otro_valor</w:t>
+      </w:r>
+      <w:proofErr w:type="spellEnd"/>
+      <w:r>
+        <w:t>` = 143;</w:t>
+      </w:r>
+    </w:p>
+    <w:p>
+      <w:pPr>
+        <w:spacing w:after="0" w:line="240" w:lineRule="auto"/>
+      </w:pPr>
+      <w:r>
+        <w:t xml:space="preserve"> </w:t>
+      </w:r>
+    </w:p>
+    <w:p>
+      <w:pPr>
+        <w:spacing w:after="0" w:line="240" w:lineRule="auto"/>
+      </w:pPr>
+    </w:p>
+    <w:p>
+      <w:pPr>
+        <w:spacing w:after="0" w:line="240" w:lineRule="auto"/>
+      </w:pPr>
+      <w:r>
+        <w:t xml:space="preserve">Si </w:t>
+      </w:r>
+      <w:proofErr w:type="spellStart"/>
+      <w:r>
+        <w:t>id_persona</w:t>
+      </w:r>
+      <w:proofErr w:type="spellEnd"/>
+      <w:r>
+        <w:t xml:space="preserve"> = 3 se debe ejecutar la siguiente sentencia:</w:t>
+      </w:r>
+    </w:p>
+    <w:p>
+      <w:pPr>
+        <w:spacing w:after="0" w:line="240" w:lineRule="auto"/>
+      </w:pPr>
+      <w:r>
+        <w:t>UPDATE `sipro_</w:t>
+      </w:r>
+      <w:proofErr w:type="spellStart"/>
+      <w:r>
+        <w:t>desa</w:t>
+      </w:r>
+      <w:proofErr w:type="spellEnd"/>
+      <w:proofErr w:type="gramStart"/>
+      <w:r>
+        <w:t>`.`</w:t>
+      </w:r>
+      <w:proofErr w:type="spellStart"/>
+      <w:proofErr w:type="gramEnd"/>
+      <w:r>
+        <w:t>otro_valor</w:t>
+      </w:r>
+      <w:proofErr w:type="spellEnd"/>
+      <w:r>
+        <w:t>`</w:t>
+      </w:r>
+    </w:p>
+    <w:p>
+      <w:pPr>
+        <w:spacing w:after="0" w:line="240" w:lineRule="auto"/>
+      </w:pPr>
+      <w:r>
+        <w:t>SET</w:t>
+      </w:r>
+    </w:p>
+    <w:p>
+      <w:pPr>
+        <w:spacing w:after="0" w:line="240" w:lineRule="auto"/>
+      </w:pPr>
+      <w:r>
+        <w:t xml:space="preserve">`valor` = `valor` + </w:t>
+      </w:r>
+      <w:proofErr w:type="gramStart"/>
+      <w:r>
+        <w:t>monto  si</w:t>
+      </w:r>
+      <w:proofErr w:type="gramEnd"/>
+      <w:r>
+        <w:t xml:space="preserve"> signo = 190  o   `valor` = `valor`-monto si signo=191</w:t>
+      </w:r>
+    </w:p>
+    <w:p>
+      <w:pPr>
+        <w:spacing w:after="0" w:line="240" w:lineRule="auto"/>
+      </w:pPr>
+      <w:r>
+        <w:t>WHERE `</w:t>
+      </w:r>
+      <w:proofErr w:type="spellStart"/>
+      <w:r>
+        <w:t>id_otro_valor</w:t>
+      </w:r>
+      <w:proofErr w:type="spellEnd"/>
+      <w:r>
+        <w:t>` = 144;</w:t>
+      </w:r>
+    </w:p>
+    <w:p>
+      <w:pPr>
+        <w:spacing w:after="0" w:line="240" w:lineRule="auto"/>
+      </w:pPr>
+      <w:r>
+        <w:t xml:space="preserve"> </w:t>
+      </w:r>
+    </w:p>
+    <w:p>
+      <w:pPr>
+        <w:spacing w:after="0" w:line="240" w:lineRule="auto"/>
+      </w:pPr>
+    </w:p>
+    <w:p>
+      <w:pPr>
+        <w:spacing w:after="0" w:line="240" w:lineRule="auto"/>
+      </w:pPr>
+      <w:r>
+        <w:t xml:space="preserve">Si </w:t>
+      </w:r>
+      <w:proofErr w:type="spellStart"/>
+      <w:r>
+        <w:t>id_persona</w:t>
+      </w:r>
+      <w:proofErr w:type="spellEnd"/>
+      <w:r>
+        <w:t xml:space="preserve"> = 5 (Argentina) se debe ejecutar la siguiente sentencia:</w:t>
+      </w:r>
+    </w:p>
+    <w:p>
+      <w:pPr>
+        <w:spacing w:after="0" w:line="240" w:lineRule="auto"/>
+      </w:pPr>
+      <w:r>
+        <w:t>UPDATE `sipro_</w:t>
+      </w:r>
+      <w:proofErr w:type="spellStart"/>
+      <w:r>
+        <w:t>desa</w:t>
+      </w:r>
+      <w:proofErr w:type="spellEnd"/>
+      <w:proofErr w:type="gramStart"/>
+      <w:r>
+        <w:t>`.`</w:t>
+      </w:r>
+      <w:proofErr w:type="spellStart"/>
+      <w:proofErr w:type="gramEnd"/>
+      <w:r>
+        <w:t>otro_valor</w:t>
+      </w:r>
+      <w:proofErr w:type="spellEnd"/>
+      <w:r>
+        <w:t>`</w:t>
+      </w:r>
+    </w:p>
+    <w:p>
+      <w:pPr>
+        <w:spacing w:after="0" w:line="240" w:lineRule="auto"/>
+      </w:pPr>
+      <w:r>
+        <w:t>SET</w:t>
+      </w:r>
+    </w:p>
+    <w:p>
+      <w:pPr>
+        <w:spacing w:after="0" w:line="240" w:lineRule="auto"/>
+      </w:pPr>
+      <w:r>
+        <w:t xml:space="preserve">`valor` = `valor` + </w:t>
+      </w:r>
+      <w:proofErr w:type="gramStart"/>
+      <w:r>
+        <w:t>monto  si</w:t>
+      </w:r>
+      <w:proofErr w:type="gramEnd"/>
+      <w:r>
+        <w:t xml:space="preserve"> signo = 190  o   `valor` = `valor`-monto si signo=191</w:t>
+      </w:r>
+    </w:p>
+    <w:p>
+      <w:pPr>
+        <w:spacing w:after="0" w:line="240" w:lineRule="auto"/>
+      </w:pPr>
+      <w:r>
+        <w:t>WHERE `</w:t>
+      </w:r>
+      <w:proofErr w:type="spellStart"/>
+      <w:r>
+        <w:t>id_otro_valor</w:t>
+      </w:r>
+      <w:proofErr w:type="spellEnd"/>
+      <w:r>
+        <w:t>` = 142;</w:t>
+      </w:r>
     </w:p>
     <w:sectPr>
       <w:pgSz w:w="11906" w:h="16838"/>

</xml_diff>